<commit_message>
Reworking paper according to reviewers' requests.
</commit_message>
<xml_diff>
--- a/BMCPointByPointRespRev2.docx
+++ b/BMCPointByPointRespRev2.docx
@@ -849,27 +849,7 @@
           <w:szCs w:val="28"/>
           <w:lang w:val="en-US"/>
         </w:rPr>
-        <w:t xml:space="preserve"> </w:t>
-      </w:r>
-      <w:r>
-        <w:rPr>
-          <w:rFonts w:ascii="Times New Roman" w:hAnsi="Times New Roman" w:cs="Times New Roman"/>
-          <w:color w:val="2F5496" w:themeColor="accent1" w:themeShade="BF"/>
-          <w:sz w:val="28"/>
-          <w:szCs w:val="28"/>
-          <w:lang w:val="en-US"/>
-        </w:rPr>
-        <w:t>because we</w:t>
-      </w:r>
-      <w:r>
-        <w:rPr>
-          <w:rFonts w:ascii="Times New Roman" w:hAnsi="Times New Roman" w:cs="Times New Roman"/>
-          <w:color w:val="2F5496" w:themeColor="accent1" w:themeShade="BF"/>
-          <w:sz w:val="28"/>
-          <w:szCs w:val="28"/>
-          <w:lang w:val="en-US"/>
-        </w:rPr>
-        <w:t xml:space="preserve"> </w:t>
+        <w:t xml:space="preserve"> because we </w:t>
       </w:r>
       <w:r>
         <w:rPr>
@@ -931,17 +911,7 @@
           <w:szCs w:val="28"/>
           <w:lang w:val="en-US"/>
         </w:rPr>
-        <w:t xml:space="preserve"> </w:t>
-      </w:r>
-      <w:r>
-        <w:rPr>
-          <w:rFonts w:ascii="Times New Roman" w:hAnsi="Times New Roman" w:cs="Times New Roman"/>
-          <w:color w:val="2F5496" w:themeColor="accent1" w:themeShade="BF"/>
-          <w:sz w:val="28"/>
-          <w:szCs w:val="28"/>
-          <w:lang w:val="en-US"/>
-        </w:rPr>
-        <w:t xml:space="preserve">of </w:t>
+        <w:t xml:space="preserve"> of </w:t>
       </w:r>
       <w:proofErr w:type="spellStart"/>
       <w:r>
@@ -952,17 +922,7 @@
           <w:szCs w:val="28"/>
           <w:lang w:val="en-US"/>
         </w:rPr>
-        <w:t>KrakenUni</w:t>
-      </w:r>
-      <w:r>
-        <w:rPr>
-          <w:rFonts w:ascii="Times New Roman" w:hAnsi="Times New Roman" w:cs="Times New Roman"/>
-          <w:color w:val="2F5496" w:themeColor="accent1" w:themeShade="BF"/>
-          <w:sz w:val="28"/>
-          <w:szCs w:val="28"/>
-          <w:lang w:val="en-US"/>
-        </w:rPr>
-        <w:t>q</w:t>
+        <w:t>KrakenUniq</w:t>
       </w:r>
       <w:proofErr w:type="spellEnd"/>
       <w:r>
@@ -1389,227 +1349,7 @@
           <w:szCs w:val="28"/>
           <w:lang w:val="en-US"/>
         </w:rPr>
-        <w:t xml:space="preserve"> compression under loss </w:t>
-      </w:r>
-      <w:proofErr w:type="spellStart"/>
-      <w:r>
-        <w:rPr>
-          <w:rFonts w:ascii="Times New Roman" w:hAnsi="Times New Roman" w:cs="Times New Roman"/>
-          <w:color w:val="2F5496" w:themeColor="accent1" w:themeShade="BF"/>
-          <w:sz w:val="28"/>
-          <w:szCs w:val="28"/>
-          <w:lang w:val="en-US"/>
-        </w:rPr>
-        <w:t>of</w:t>
-      </w:r>
-      <w:proofErr w:type="spellEnd"/>
-      <w:r>
-        <w:rPr>
-          <w:rFonts w:ascii="Times New Roman" w:hAnsi="Times New Roman" w:cs="Times New Roman"/>
-          <w:color w:val="2F5496" w:themeColor="accent1" w:themeShade="BF"/>
-          <w:sz w:val="28"/>
-          <w:szCs w:val="28"/>
-          <w:lang w:val="en-US"/>
-        </w:rPr>
-        <w:t xml:space="preserve"> </w:t>
-      </w:r>
-      <w:proofErr w:type="spellStart"/>
-      <w:r>
-        <w:rPr>
-          <w:rFonts w:ascii="Times New Roman" w:hAnsi="Times New Roman" w:cs="Times New Roman"/>
-          <w:color w:val="2F5496" w:themeColor="accent1" w:themeShade="BF"/>
-          <w:sz w:val="28"/>
-          <w:szCs w:val="28"/>
-          <w:lang w:val="en-US"/>
-        </w:rPr>
-        <w:t>information</w:t>
-      </w:r>
-      <w:proofErr w:type="spellEnd"/>
-      <w:r>
-        <w:rPr>
-          <w:rFonts w:ascii="Times New Roman" w:hAnsi="Times New Roman" w:cs="Times New Roman"/>
-          <w:color w:val="2F5496" w:themeColor="accent1" w:themeShade="BF"/>
-          <w:sz w:val="28"/>
-          <w:szCs w:val="28"/>
-          <w:lang w:val="en-US"/>
-        </w:rPr>
-        <w:t xml:space="preserve">. But </w:t>
-      </w:r>
-      <w:proofErr w:type="spellStart"/>
-      <w:r>
-        <w:rPr>
-          <w:rFonts w:ascii="Times New Roman" w:hAnsi="Times New Roman" w:cs="Times New Roman"/>
-          <w:color w:val="2F5496" w:themeColor="accent1" w:themeShade="BF"/>
-          <w:sz w:val="28"/>
-          <w:szCs w:val="28"/>
-          <w:lang w:val="en-US"/>
-        </w:rPr>
-        <w:t>that</w:t>
-      </w:r>
-      <w:proofErr w:type="spellEnd"/>
-      <w:r>
-        <w:rPr>
-          <w:rFonts w:ascii="Times New Roman" w:hAnsi="Times New Roman" w:cs="Times New Roman"/>
-          <w:color w:val="2F5496" w:themeColor="accent1" w:themeShade="BF"/>
-          <w:sz w:val="28"/>
-          <w:szCs w:val="28"/>
-          <w:lang w:val="en-US"/>
-        </w:rPr>
-        <w:t xml:space="preserve"> </w:t>
-      </w:r>
-      <w:proofErr w:type="spellStart"/>
-      <w:r>
-        <w:rPr>
-          <w:rFonts w:ascii="Times New Roman" w:hAnsi="Times New Roman" w:cs="Times New Roman"/>
-          <w:color w:val="2F5496" w:themeColor="accent1" w:themeShade="BF"/>
-          <w:sz w:val="28"/>
-          <w:szCs w:val="28"/>
-          <w:lang w:val="en-US"/>
-        </w:rPr>
-        <w:t>loss</w:t>
-      </w:r>
-      <w:proofErr w:type="spellEnd"/>
-      <w:r>
-        <w:rPr>
-          <w:rFonts w:ascii="Times New Roman" w:hAnsi="Times New Roman" w:cs="Times New Roman"/>
-          <w:color w:val="2F5496" w:themeColor="accent1" w:themeShade="BF"/>
-          <w:sz w:val="28"/>
-          <w:szCs w:val="28"/>
-          <w:lang w:val="en-US"/>
-        </w:rPr>
-        <w:t xml:space="preserve"> </w:t>
-      </w:r>
-      <w:proofErr w:type="spellStart"/>
-      <w:r>
-        <w:rPr>
-          <w:rFonts w:ascii="Times New Roman" w:hAnsi="Times New Roman" w:cs="Times New Roman"/>
-          <w:color w:val="2F5496" w:themeColor="accent1" w:themeShade="BF"/>
-          <w:sz w:val="28"/>
-          <w:szCs w:val="28"/>
-          <w:lang w:val="en-US"/>
-        </w:rPr>
-        <w:t>of</w:t>
-      </w:r>
-      <w:proofErr w:type="spellEnd"/>
-      <w:r>
-        <w:rPr>
-          <w:rFonts w:ascii="Times New Roman" w:hAnsi="Times New Roman" w:cs="Times New Roman"/>
-          <w:color w:val="2F5496" w:themeColor="accent1" w:themeShade="BF"/>
-          <w:sz w:val="28"/>
-          <w:szCs w:val="28"/>
-          <w:lang w:val="en-US"/>
-        </w:rPr>
-        <w:t xml:space="preserve"> </w:t>
-      </w:r>
-      <w:proofErr w:type="spellStart"/>
-      <w:r>
-        <w:rPr>
-          <w:rFonts w:ascii="Times New Roman" w:hAnsi="Times New Roman" w:cs="Times New Roman"/>
-          <w:color w:val="2F5496" w:themeColor="accent1" w:themeShade="BF"/>
-          <w:sz w:val="28"/>
-          <w:szCs w:val="28"/>
-          <w:lang w:val="en-US"/>
-        </w:rPr>
-        <w:t>information</w:t>
-      </w:r>
-      <w:proofErr w:type="spellEnd"/>
-      <w:r>
-        <w:rPr>
-          <w:rFonts w:ascii="Times New Roman" w:hAnsi="Times New Roman" w:cs="Times New Roman"/>
-          <w:color w:val="2F5496" w:themeColor="accent1" w:themeShade="BF"/>
-          <w:sz w:val="28"/>
-          <w:szCs w:val="28"/>
-          <w:lang w:val="en-US"/>
-        </w:rPr>
-        <w:t xml:space="preserve"> </w:t>
-      </w:r>
-      <w:proofErr w:type="spellStart"/>
-      <w:r>
-        <w:rPr>
-          <w:rFonts w:ascii="Times New Roman" w:hAnsi="Times New Roman" w:cs="Times New Roman"/>
-          <w:color w:val="2F5496" w:themeColor="accent1" w:themeShade="BF"/>
-          <w:sz w:val="28"/>
-          <w:szCs w:val="28"/>
-          <w:lang w:val="en-US"/>
-        </w:rPr>
-        <w:t>is</w:t>
-      </w:r>
-      <w:proofErr w:type="spellEnd"/>
-      <w:r>
-        <w:rPr>
-          <w:rFonts w:ascii="Times New Roman" w:hAnsi="Times New Roman" w:cs="Times New Roman"/>
-          <w:color w:val="2F5496" w:themeColor="accent1" w:themeShade="BF"/>
-          <w:sz w:val="28"/>
-          <w:szCs w:val="28"/>
-          <w:lang w:val="en-US"/>
-        </w:rPr>
-        <w:t xml:space="preserve"> an </w:t>
-      </w:r>
-      <w:proofErr w:type="spellStart"/>
-      <w:r>
-        <w:rPr>
-          <w:rFonts w:ascii="Times New Roman" w:hAnsi="Times New Roman" w:cs="Times New Roman"/>
-          <w:color w:val="2F5496" w:themeColor="accent1" w:themeShade="BF"/>
-          <w:sz w:val="28"/>
-          <w:szCs w:val="28"/>
-          <w:lang w:val="en-US"/>
-        </w:rPr>
-        <w:t>inherent</w:t>
-      </w:r>
-      <w:proofErr w:type="spellEnd"/>
-      <w:r>
-        <w:rPr>
-          <w:rFonts w:ascii="Times New Roman" w:hAnsi="Times New Roman" w:cs="Times New Roman"/>
-          <w:color w:val="2F5496" w:themeColor="accent1" w:themeShade="BF"/>
-          <w:sz w:val="28"/>
-          <w:szCs w:val="28"/>
-          <w:lang w:val="en-US"/>
-        </w:rPr>
-        <w:t xml:space="preserve"> source </w:t>
-      </w:r>
-      <w:proofErr w:type="spellStart"/>
-      <w:r>
-        <w:rPr>
-          <w:rFonts w:ascii="Times New Roman" w:hAnsi="Times New Roman" w:cs="Times New Roman"/>
-          <w:color w:val="2F5496" w:themeColor="accent1" w:themeShade="BF"/>
-          <w:sz w:val="28"/>
-          <w:szCs w:val="28"/>
-          <w:lang w:val="en-US"/>
-        </w:rPr>
-        <w:t>of</w:t>
-      </w:r>
-      <w:proofErr w:type="spellEnd"/>
-      <w:r>
-        <w:rPr>
-          <w:rFonts w:ascii="Times New Roman" w:hAnsi="Times New Roman" w:cs="Times New Roman"/>
-          <w:color w:val="2F5496" w:themeColor="accent1" w:themeShade="BF"/>
-          <w:sz w:val="28"/>
-          <w:szCs w:val="28"/>
-          <w:lang w:val="en-US"/>
-        </w:rPr>
-        <w:t xml:space="preserve"> </w:t>
-      </w:r>
-      <w:proofErr w:type="spellStart"/>
-      <w:r>
-        <w:rPr>
-          <w:rFonts w:ascii="Times New Roman" w:hAnsi="Times New Roman" w:cs="Times New Roman"/>
-          <w:color w:val="2F5496" w:themeColor="accent1" w:themeShade="BF"/>
-          <w:sz w:val="28"/>
-          <w:szCs w:val="28"/>
-          <w:lang w:val="en-US"/>
-        </w:rPr>
-        <w:t>false</w:t>
-      </w:r>
-      <w:proofErr w:type="spellEnd"/>
-      <w:r>
-        <w:rPr>
-          <w:rFonts w:ascii="Times New Roman" w:hAnsi="Times New Roman" w:cs="Times New Roman"/>
-          <w:color w:val="2F5496" w:themeColor="accent1" w:themeShade="BF"/>
-          <w:sz w:val="28"/>
-          <w:szCs w:val="28"/>
-          <w:lang w:val="en-US"/>
-        </w:rPr>
-        <w:t xml:space="preserve"> positives. The requirement “</w:t>
+        <w:t xml:space="preserve"> compression under loss of information. But that loss of information is an inherent source of false positives. The requirement “</w:t>
       </w:r>
       <w:r>
         <w:rPr>
@@ -1962,77 +1702,7 @@
           <w:szCs w:val="28"/>
           <w:lang w:val="en-US"/>
         </w:rPr>
-        <w:t xml:space="preserve">Nevertheless, the reviewer </w:t>
-      </w:r>
-      <w:r>
-        <w:rPr>
-          <w:rFonts w:ascii="Times New Roman" w:hAnsi="Times New Roman" w:cs="Times New Roman"/>
-          <w:color w:val="2F5496" w:themeColor="accent1" w:themeShade="BF"/>
-          <w:sz w:val="28"/>
-          <w:szCs w:val="28"/>
-          <w:lang w:val="en-US"/>
-        </w:rPr>
-        <w:t>is right:</w:t>
-      </w:r>
-      <w:r>
-        <w:rPr>
-          <w:rFonts w:ascii="Times New Roman" w:hAnsi="Times New Roman" w:cs="Times New Roman"/>
-          <w:color w:val="2F5496" w:themeColor="accent1" w:themeShade="BF"/>
-          <w:sz w:val="28"/>
-          <w:szCs w:val="28"/>
-          <w:lang w:val="en-US"/>
-        </w:rPr>
-        <w:t xml:space="preserve"> </w:t>
-      </w:r>
-      <w:r>
-        <w:rPr>
-          <w:rFonts w:ascii="Times New Roman" w:hAnsi="Times New Roman" w:cs="Times New Roman"/>
-          <w:color w:val="2F5496" w:themeColor="accent1" w:themeShade="BF"/>
-          <w:sz w:val="28"/>
-          <w:szCs w:val="28"/>
-          <w:lang w:val="en-US"/>
-        </w:rPr>
-        <w:t>T</w:t>
-      </w:r>
-      <w:r>
-        <w:rPr>
-          <w:rFonts w:ascii="Times New Roman" w:hAnsi="Times New Roman" w:cs="Times New Roman"/>
-          <w:color w:val="2F5496" w:themeColor="accent1" w:themeShade="BF"/>
-          <w:sz w:val="28"/>
-          <w:szCs w:val="28"/>
-          <w:lang w:val="en-US"/>
-        </w:rPr>
-        <w:t xml:space="preserve">he evaluation </w:t>
-      </w:r>
-      <w:r>
-        <w:rPr>
-          <w:rFonts w:ascii="Times New Roman" w:hAnsi="Times New Roman" w:cs="Times New Roman"/>
-          <w:color w:val="2F5496" w:themeColor="accent1" w:themeShade="BF"/>
-          <w:sz w:val="28"/>
-          <w:szCs w:val="28"/>
-          <w:lang w:val="en-US"/>
-        </w:rPr>
-        <w:t>must be</w:t>
-      </w:r>
-      <w:r>
-        <w:rPr>
-          <w:rFonts w:ascii="Times New Roman" w:hAnsi="Times New Roman" w:cs="Times New Roman"/>
-          <w:color w:val="2F5496" w:themeColor="accent1" w:themeShade="BF"/>
-          <w:sz w:val="28"/>
-          <w:szCs w:val="28"/>
-          <w:lang w:val="en-US"/>
-        </w:rPr>
-        <w:t xml:space="preserve"> broade</w:t>
-      </w:r>
-      <w:r>
-        <w:rPr>
-          <w:rFonts w:ascii="Times New Roman" w:hAnsi="Times New Roman" w:cs="Times New Roman"/>
-          <w:color w:val="2F5496" w:themeColor="accent1" w:themeShade="BF"/>
-          <w:sz w:val="28"/>
-          <w:szCs w:val="28"/>
-          <w:lang w:val="en-US"/>
-        </w:rPr>
-        <w:t xml:space="preserve">ned in order to better assess the performance of </w:t>
+        <w:t xml:space="preserve">Nevertheless, the reviewer is right: The evaluation must be broadened in order to better assess the performance of </w:t>
       </w:r>
       <w:proofErr w:type="spellStart"/>
       <w:r>
@@ -3384,7 +3054,27 @@
           <w:szCs w:val="28"/>
           <w:lang w:val="en-US"/>
         </w:rPr>
-        <w:t xml:space="preserve"> entries are avoided via a Boom filter</w:t>
+        <w:t xml:space="preserve"> entries are avoided via a B</w:t>
+      </w:r>
+      <w:r>
+        <w:rPr>
+          <w:rFonts w:ascii="Times New Roman" w:hAnsi="Times New Roman" w:cs="Times New Roman"/>
+          <w:color w:val="2F5496" w:themeColor="accent1" w:themeShade="BF"/>
+          <w:sz w:val="28"/>
+          <w:szCs w:val="28"/>
+          <w:lang w:val="en-US"/>
+        </w:rPr>
+        <w:t>l</w:t>
+      </w:r>
+      <w:r>
+        <w:rPr>
+          <w:rFonts w:ascii="Times New Roman" w:hAnsi="Times New Roman" w:cs="Times New Roman"/>
+          <w:color w:val="2F5496" w:themeColor="accent1" w:themeShade="BF"/>
+          <w:sz w:val="28"/>
+          <w:szCs w:val="28"/>
+          <w:lang w:val="en-US"/>
+        </w:rPr>
+        <w:t>oom filter</w:t>
       </w:r>
       <w:r>
         <w:rPr>
@@ -4712,7 +4402,27 @@
           <w:szCs w:val="28"/>
           <w:lang w:val="en-US"/>
         </w:rPr>
-        <w:t>goal “index” (see Section 2.3).</w:t>
+        <w:t xml:space="preserve">goal “index” (see </w:t>
+      </w:r>
+      <w:r>
+        <w:rPr>
+          <w:rFonts w:ascii="Times New Roman" w:hAnsi="Times New Roman" w:cs="Times New Roman"/>
+          <w:color w:val="2F5496" w:themeColor="accent1" w:themeShade="BF"/>
+          <w:sz w:val="28"/>
+          <w:szCs w:val="28"/>
+          <w:lang w:val="en-US"/>
+        </w:rPr>
+        <w:t xml:space="preserve">originally </w:t>
+      </w:r>
+      <w:r>
+        <w:rPr>
+          <w:rFonts w:ascii="Times New Roman" w:hAnsi="Times New Roman" w:cs="Times New Roman"/>
+          <w:color w:val="2F5496" w:themeColor="accent1" w:themeShade="BF"/>
+          <w:sz w:val="28"/>
+          <w:szCs w:val="28"/>
+          <w:lang w:val="en-US"/>
+        </w:rPr>
+        <w:t>Section 2.3).</w:t>
       </w:r>
     </w:p>
     <w:p>
@@ -4757,17 +4467,57 @@
           <w:szCs w:val="28"/>
           <w:lang w:val="en-US"/>
         </w:rPr>
-        <w:t>Regarding 3) we extended paragraph 2 from Section 2.3 to explain the procedure more thoroughly there.</w:t>
-      </w:r>
-      <w:r>
-        <w:rPr>
-          <w:rFonts w:ascii="Times New Roman" w:hAnsi="Times New Roman" w:cs="Times New Roman"/>
-          <w:color w:val="2F5496" w:themeColor="accent1" w:themeShade="BF"/>
-          <w:sz w:val="28"/>
-          <w:szCs w:val="28"/>
-          <w:lang w:val="en-US"/>
-        </w:rPr>
-        <w:t xml:space="preserve"> We added evaluation data in Section ?? and the Supplementary to assess and solidify the performance gain of the added Bloom filter. The measured averaged gain is referenced and mentioned also in Section 2.3.</w:t>
+        <w:t>Regarding 3) we extended paragraph Section 2.</w:t>
+      </w:r>
+      <w:r>
+        <w:rPr>
+          <w:rFonts w:ascii="Times New Roman" w:hAnsi="Times New Roman" w:cs="Times New Roman"/>
+          <w:color w:val="2F5496" w:themeColor="accent1" w:themeShade="BF"/>
+          <w:sz w:val="28"/>
+          <w:szCs w:val="28"/>
+          <w:lang w:val="en-US"/>
+        </w:rPr>
+        <w:t>2</w:t>
+      </w:r>
+      <w:r>
+        <w:rPr>
+          <w:rFonts w:ascii="Times New Roman" w:hAnsi="Times New Roman" w:cs="Times New Roman"/>
+          <w:color w:val="2F5496" w:themeColor="accent1" w:themeShade="BF"/>
+          <w:sz w:val="28"/>
+          <w:szCs w:val="28"/>
+          <w:lang w:val="en-US"/>
+        </w:rPr>
+        <w:t xml:space="preserve"> to explain the procedure more thoroughly there.</w:t>
+      </w:r>
+      <w:r>
+        <w:rPr>
+          <w:rFonts w:ascii="Times New Roman" w:hAnsi="Times New Roman" w:cs="Times New Roman"/>
+          <w:color w:val="2F5496" w:themeColor="accent1" w:themeShade="BF"/>
+          <w:sz w:val="28"/>
+          <w:szCs w:val="28"/>
+          <w:lang w:val="en-US"/>
+        </w:rPr>
+        <w:t xml:space="preserve"> We added evaluation data in Section ?? and the Supplementary to assess and solidify the performance gain of the added Bloom filter. The measured averaged gain is referenced and mentioned also in Section 2.</w:t>
+      </w:r>
+      <w:r>
+        <w:rPr>
+          <w:rFonts w:ascii="Times New Roman" w:hAnsi="Times New Roman" w:cs="Times New Roman"/>
+          <w:color w:val="2F5496" w:themeColor="accent1" w:themeShade="BF"/>
+          <w:sz w:val="28"/>
+          <w:szCs w:val="28"/>
+          <w:lang w:val="en-US"/>
+        </w:rPr>
+        <w:t>2</w:t>
+      </w:r>
+      <w:r>
+        <w:rPr>
+          <w:rFonts w:ascii="Times New Roman" w:hAnsi="Times New Roman" w:cs="Times New Roman"/>
+          <w:color w:val="2F5496" w:themeColor="accent1" w:themeShade="BF"/>
+          <w:sz w:val="28"/>
+          <w:szCs w:val="28"/>
+          <w:lang w:val="en-US"/>
+        </w:rPr>
+        <w:t>.</w:t>
       </w:r>
     </w:p>
     <w:p>
@@ -6407,17 +6157,37 @@
           <w:szCs w:val="28"/>
           <w:lang w:val="en-US"/>
         </w:rPr>
-        <w:t xml:space="preserve"> We added a paragraph to Section 2.</w:t>
-      </w:r>
-      <w:r>
-        <w:rPr>
-          <w:rFonts w:ascii="Times New Roman" w:hAnsi="Times New Roman" w:cs="Times New Roman"/>
-          <w:color w:val="2F5496" w:themeColor="accent1" w:themeShade="BF"/>
-          <w:sz w:val="28"/>
-          <w:szCs w:val="28"/>
-          <w:lang w:val="en-US"/>
-        </w:rPr>
-        <w:t>3</w:t>
+        <w:t xml:space="preserve"> We added a paragraph </w:t>
+      </w:r>
+      <w:r>
+        <w:rPr>
+          <w:rFonts w:ascii="Times New Roman" w:hAnsi="Times New Roman" w:cs="Times New Roman"/>
+          <w:color w:val="2F5496" w:themeColor="accent1" w:themeShade="BF"/>
+          <w:sz w:val="28"/>
+          <w:szCs w:val="28"/>
+          <w:lang w:val="en-US"/>
+        </w:rPr>
+        <w:t xml:space="preserve">and footnote </w:t>
+      </w:r>
+      <w:r>
+        <w:rPr>
+          <w:rFonts w:ascii="Times New Roman" w:hAnsi="Times New Roman" w:cs="Times New Roman"/>
+          <w:color w:val="2F5496" w:themeColor="accent1" w:themeShade="BF"/>
+          <w:sz w:val="28"/>
+          <w:szCs w:val="28"/>
+          <w:lang w:val="en-US"/>
+        </w:rPr>
+        <w:t>to Section 2.</w:t>
+      </w:r>
+      <w:r>
+        <w:rPr>
+          <w:rFonts w:ascii="Times New Roman" w:hAnsi="Times New Roman" w:cs="Times New Roman"/>
+          <w:color w:val="2F5496" w:themeColor="accent1" w:themeShade="BF"/>
+          <w:sz w:val="28"/>
+          <w:szCs w:val="28"/>
+          <w:lang w:val="en-US"/>
+        </w:rPr>
+        <w:t>2</w:t>
       </w:r>
       <w:r>
         <w:rPr>
@@ -6497,141 +6267,7 @@
           <w:szCs w:val="28"/>
           <w:lang w:val="en-US"/>
         </w:rPr>
-        <w:t xml:space="preserve">. We included a hint </w:t>
-      </w:r>
-      <w:r>
-        <w:rPr>
-          <w:rFonts w:ascii="Times New Roman" w:hAnsi="Times New Roman" w:cs="Times New Roman"/>
-          <w:color w:val="2F5496" w:themeColor="accent1" w:themeShade="BF"/>
-          <w:sz w:val="28"/>
-          <w:szCs w:val="28"/>
-          <w:lang w:val="en-US"/>
-        </w:rPr>
-        <w:t xml:space="preserve">on future work with regard </w:t>
-      </w:r>
-      <w:r>
-        <w:rPr>
-          <w:rFonts w:ascii="Times New Roman" w:hAnsi="Times New Roman" w:cs="Times New Roman"/>
-          <w:color w:val="2F5496" w:themeColor="accent1" w:themeShade="BF"/>
-          <w:sz w:val="28"/>
-          <w:szCs w:val="28"/>
-          <w:lang w:val="en-US"/>
-        </w:rPr>
-        <w:t xml:space="preserve">to </w:t>
-      </w:r>
-      <w:r>
-        <w:rPr>
-          <w:rFonts w:ascii="Times New Roman" w:hAnsi="Times New Roman" w:cs="Times New Roman"/>
-          <w:color w:val="2F5496" w:themeColor="accent1" w:themeShade="BF"/>
-          <w:sz w:val="28"/>
-          <w:szCs w:val="28"/>
-          <w:lang w:val="en-US"/>
-        </w:rPr>
-        <w:t xml:space="preserve">other filter implementations in </w:t>
-      </w:r>
-      <w:proofErr w:type="spellStart"/>
-      <w:r>
-        <w:rPr>
-          <w:rFonts w:ascii="Times New Roman" w:hAnsi="Times New Roman" w:cs="Times New Roman"/>
-          <w:color w:val="2F5496" w:themeColor="accent1" w:themeShade="BF"/>
-          <w:sz w:val="28"/>
-          <w:szCs w:val="28"/>
-          <w:lang w:val="en-US"/>
-        </w:rPr>
-        <w:t>Genestrip</w:t>
-      </w:r>
-      <w:proofErr w:type="spellEnd"/>
-      <w:r>
-        <w:rPr>
-          <w:rFonts w:ascii="Times New Roman" w:hAnsi="Times New Roman" w:cs="Times New Roman"/>
-          <w:color w:val="2F5496" w:themeColor="accent1" w:themeShade="BF"/>
-          <w:sz w:val="28"/>
-          <w:szCs w:val="28"/>
-          <w:lang w:val="en-US"/>
-        </w:rPr>
-        <w:t xml:space="preserve"> for 3) and 4) from above.</w:t>
-      </w:r>
-      <w:r>
-        <w:rPr>
-          <w:rFonts w:ascii="Times New Roman" w:hAnsi="Times New Roman" w:cs="Times New Roman"/>
-          <w:color w:val="2F5496" w:themeColor="accent1" w:themeShade="BF"/>
-          <w:sz w:val="28"/>
-          <w:szCs w:val="28"/>
-          <w:lang w:val="en-US"/>
-        </w:rPr>
-        <w:t xml:space="preserve"> </w:t>
-      </w:r>
-      <w:r>
-        <w:rPr>
-          <w:rFonts w:ascii="Times New Roman" w:hAnsi="Times New Roman" w:cs="Times New Roman"/>
-          <w:color w:val="2F5496" w:themeColor="accent1" w:themeShade="BF"/>
-          <w:sz w:val="28"/>
-          <w:szCs w:val="28"/>
-          <w:lang w:val="en-US"/>
-        </w:rPr>
-        <w:t>(</w:t>
-      </w:r>
-      <w:r>
-        <w:rPr>
-          <w:rFonts w:ascii="Times New Roman" w:hAnsi="Times New Roman" w:cs="Times New Roman"/>
-          <w:color w:val="2F5496" w:themeColor="accent1" w:themeShade="BF"/>
-          <w:sz w:val="28"/>
-          <w:szCs w:val="28"/>
-          <w:lang w:val="en-US"/>
-        </w:rPr>
-        <w:t xml:space="preserve">In particular we consider the </w:t>
-      </w:r>
-      <w:r>
-        <w:rPr>
-          <w:rFonts w:ascii="Times New Roman" w:hAnsi="Times New Roman" w:cs="Times New Roman"/>
-          <w:color w:val="2F5496" w:themeColor="accent1" w:themeShade="BF"/>
-          <w:sz w:val="28"/>
-          <w:szCs w:val="28"/>
-          <w:lang w:val="en-US"/>
-        </w:rPr>
-        <w:t xml:space="preserve">so-called </w:t>
-      </w:r>
-      <w:r>
-        <w:rPr>
-          <w:rFonts w:ascii="Times New Roman" w:hAnsi="Times New Roman" w:cs="Times New Roman"/>
-          <w:color w:val="2F5496" w:themeColor="accent1" w:themeShade="BF"/>
-          <w:sz w:val="28"/>
-          <w:szCs w:val="28"/>
-          <w:lang w:val="en-US"/>
-        </w:rPr>
-        <w:t xml:space="preserve">Blocked Bloom filter as an alternative for future improvements of </w:t>
-      </w:r>
-      <w:proofErr w:type="spellStart"/>
-      <w:r>
-        <w:rPr>
-          <w:rFonts w:ascii="Times New Roman" w:hAnsi="Times New Roman" w:cs="Times New Roman"/>
-          <w:color w:val="2F5496" w:themeColor="accent1" w:themeShade="BF"/>
-          <w:sz w:val="28"/>
-          <w:szCs w:val="28"/>
-          <w:lang w:val="en-US"/>
-        </w:rPr>
-        <w:t>Genestrip</w:t>
-      </w:r>
-      <w:proofErr w:type="spellEnd"/>
-      <w:r>
-        <w:rPr>
-          <w:rFonts w:ascii="Times New Roman" w:hAnsi="Times New Roman" w:cs="Times New Roman"/>
-          <w:color w:val="2F5496" w:themeColor="accent1" w:themeShade="BF"/>
-          <w:sz w:val="28"/>
-          <w:szCs w:val="28"/>
-          <w:lang w:val="en-US"/>
-        </w:rPr>
-        <w:t>.</w:t>
-      </w:r>
-      <w:r>
-        <w:rPr>
-          <w:rFonts w:ascii="Times New Roman" w:hAnsi="Times New Roman" w:cs="Times New Roman"/>
-          <w:color w:val="2F5496" w:themeColor="accent1" w:themeShade="BF"/>
-          <w:sz w:val="28"/>
-          <w:szCs w:val="28"/>
-          <w:lang w:val="en-US"/>
-        </w:rPr>
-        <w:t>)</w:t>
+        <w:t xml:space="preserve">. </w:t>
       </w:r>
     </w:p>
     <w:p>
@@ -8260,7 +7896,7 @@
           <w:szCs w:val="28"/>
           <w:lang w:val="en-US"/>
         </w:rPr>
-        <w:t>We dropped the paragraphs 2 and 3 from Section 2.3 in favor of a compact discussion o</w:t>
+        <w:t>We dropped Section 2.3 in favor of a compact discussion o</w:t>
       </w:r>
       <w:r>
         <w:rPr>
@@ -8334,6 +7970,16 @@
         <w:t>Genestrip</w:t>
       </w:r>
       <w:proofErr w:type="spellEnd"/>
+      <w:r>
+        <w:rPr>
+          <w:rFonts w:ascii="Times New Roman" w:hAnsi="Times New Roman" w:cs="Times New Roman"/>
+          <w:color w:val="2F5496" w:themeColor="accent1" w:themeShade="BF"/>
+          <w:sz w:val="28"/>
+          <w:szCs w:val="28"/>
+          <w:lang w:val="en-US"/>
+        </w:rPr>
+        <w:t xml:space="preserve"> as part of Section 2.2</w:t>
+      </w:r>
       <w:r>
         <w:rPr>
           <w:rFonts w:ascii="Times New Roman" w:hAnsi="Times New Roman" w:cs="Times New Roman"/>
@@ -8729,7 +8375,27 @@
           <w:szCs w:val="28"/>
           <w:lang w:val="en-US"/>
         </w:rPr>
-        <w:t>”.</w:t>
+        <w:t>”</w:t>
+      </w:r>
+      <w:r>
+        <w:rPr>
+          <w:rFonts w:ascii="Times New Roman" w:hAnsi="Times New Roman" w:cs="Times New Roman"/>
+          <w:color w:val="2F5496" w:themeColor="accent1" w:themeShade="BF"/>
+          <w:sz w:val="28"/>
+          <w:szCs w:val="28"/>
+          <w:lang w:val="en-US"/>
+        </w:rPr>
+        <w:t xml:space="preserve"> in the future</w:t>
+      </w:r>
+      <w:r>
+        <w:rPr>
+          <w:rFonts w:ascii="Times New Roman" w:hAnsi="Times New Roman" w:cs="Times New Roman"/>
+          <w:color w:val="2F5496" w:themeColor="accent1" w:themeShade="BF"/>
+          <w:sz w:val="28"/>
+          <w:szCs w:val="28"/>
+          <w:lang w:val="en-US"/>
+        </w:rPr>
+        <w:t>.</w:t>
       </w:r>
       <w:r>
         <w:rPr>
@@ -9038,7 +8704,17 @@
           <w:szCs w:val="28"/>
           <w:lang w:val="en-US"/>
         </w:rPr>
-        <w:t>almost as</w:t>
+        <w:t>largely</w:t>
+      </w:r>
+      <w:r>
+        <w:rPr>
+          <w:rFonts w:ascii="Times New Roman" w:hAnsi="Times New Roman" w:cs="Times New Roman"/>
+          <w:color w:val="2F5496" w:themeColor="accent1" w:themeShade="BF"/>
+          <w:sz w:val="28"/>
+          <w:szCs w:val="28"/>
+          <w:lang w:val="en-US"/>
+        </w:rPr>
+        <w:t xml:space="preserve"> as</w:t>
       </w:r>
       <w:r>
         <w:rPr>
@@ -10357,17 +10033,7 @@
           <w:szCs w:val="28"/>
           <w:lang w:val="en-US"/>
         </w:rPr>
-        <w:t xml:space="preserve"> files that are meant to come close to the </w:t>
-      </w:r>
-      <w:r>
-        <w:rPr>
-          <w:rFonts w:ascii="Times New Roman" w:hAnsi="Times New Roman" w:cs="Times New Roman"/>
-          <w:color w:val="2F5496" w:themeColor="accent1" w:themeShade="BF"/>
-          <w:sz w:val="28"/>
-          <w:szCs w:val="28"/>
-          <w:lang w:val="en-US"/>
-        </w:rPr>
-        <w:t>real</w:t>
+        <w:t xml:space="preserve"> files that are meant to come close to the real</w:t>
       </w:r>
       <w:r>
         <w:rPr>
@@ -10387,17 +10053,7 @@
           <w:szCs w:val="28"/>
           <w:lang w:val="en-US"/>
         </w:rPr>
-        <w:t>world</w:t>
-      </w:r>
-      <w:r>
-        <w:rPr>
-          <w:rFonts w:ascii="Times New Roman" w:hAnsi="Times New Roman" w:cs="Times New Roman"/>
-          <w:color w:val="2F5496" w:themeColor="accent1" w:themeShade="BF"/>
-          <w:sz w:val="28"/>
-          <w:szCs w:val="28"/>
-          <w:lang w:val="en-US"/>
-        </w:rPr>
-        <w:t xml:space="preserve"> tick files but with </w:t>
+        <w:t xml:space="preserve">world tick files but with </w:t>
       </w:r>
       <w:r>
         <w:rPr>
@@ -11660,6 +11316,7 @@
   <w:style w:type="character" w:default="1" w:styleId="Absatz-Standardschriftart">
     <w:name w:val="Default Paragraph Font"/>
     <w:uiPriority w:val="1"/>
+    <w:semiHidden/>
     <w:unhideWhenUsed/>
   </w:style>
   <w:style w:type="table" w:default="1" w:styleId="NormaleTabelle">

</xml_diff>